<commit_message>
Prepare JPBI reproducibility release
</commit_message>
<xml_diff>
--- a/submission/jpbi_cover_letter.docx
+++ b/submission/jpbi_cover_letter.docx
@@ -11,7 +11,9 @@
       </w:pPr>
       <w:r>
         <w:rPr>
+          <w:rFonts w:ascii="Arial" w:hAnsi="Arial"/>
           <w:b/>
+          <w:color w:val="000000"/>
           <w:sz w:val="28"/>
         </w:rPr>
         <w:t>Cover Letter</w:t>
@@ -24,7 +26,10 @@
         <w:rPr/>
       </w:pPr>
       <w:r>
-        <w:rPr/>
+        <w:rPr>
+          <w:rFonts w:ascii="Arial" w:hAnsi="Arial"/>
+          <w:color w:val="000000"/>
+        </w:rPr>
         <w:t>Dear Editors,</w:t>
       </w:r>
     </w:p>
@@ -35,7 +40,10 @@
         <w:rPr/>
       </w:pPr>
       <w:r>
-        <w:rPr/>
+        <w:rPr>
+          <w:rFonts w:ascii="Arial" w:hAnsi="Arial"/>
+          <w:color w:val="000000"/>
+        </w:rPr>
         <w:t>We submit “When More Omics Is Not Always Better: Drug- and Dataset-Conditional Value of Multimodal Cancer Pharmacogenomics” as a Research article. The study evaluates multimodal information fusion for cancer drug-response prediction using a declared 15-compound universe spanning GDSC1, GDSC2, and CTD².</w:t>
       </w:r>
     </w:p>
@@ -46,7 +54,10 @@
         <w:rPr/>
       </w:pPr>
       <w:r>
-        <w:rPr/>
+        <w:rPr>
+          <w:rFonts w:ascii="Arial" w:hAnsi="Arial"/>
+          <w:color w:val="000000"/>
+        </w:rPr>
         <w:t>The manuscript fits Journal of Pharmaceutical and BioTech Industry (JPBI) because it studies feature-level fusion in an imperfect and incomplete biomedical environment, with explicit attention to missingness, redundancy, algorithmic comparison, and cross-source transfer. The central finding is that fusion is conditional: it produced a small mean improvement across five full-universe drug-held-out splits, favored fusion in three splits and expression in two, and was slightly worse in all three leave-one-dataset-out folds.</w:t>
       </w:r>
     </w:p>
@@ -57,7 +68,10 @@
         <w:rPr/>
       </w:pPr>
       <w:r>
-        <w:rPr/>
+        <w:rPr>
+          <w:rFonts w:ascii="Arial" w:hAnsi="Arial"/>
+          <w:color w:val="000000"/>
+        </w:rPr>
         <w:t>State of the art: the study is positioned against CCLE/GDSC pharmacogenomic resources, multimodal drug-response methods including MOLI, and machine-learning benchmarks of multi-omics integration [Barretina et al., 2012; Iorio et al., 2016; Tsherniak et al., 2017; Azuaje, 2017; Sharifi-Noghabi et al., 2019; Cai et al., 2022]. The contribution is evaluation design and evidence-bounded comparison, not a claim of a new deep-learning architecture.</w:t>
       </w:r>
     </w:p>
@@ -68,7 +82,10 @@
         <w:rPr/>
       </w:pPr>
       <w:r>
-        <w:rPr/>
+        <w:rPr>
+          <w:rFonts w:ascii="Arial" w:hAnsi="Arial"/>
+          <w:color w:val="000000"/>
+        </w:rPr>
         <w:t>Public datasets: we used DepMap response and molecular releases for GDSC1, GDSC2, and CTD², with release identifiers and checksums recorded in the repository. Raw files are not redistributed.</w:t>
       </w:r>
     </w:p>
@@ -79,7 +96,10 @@
         <w:rPr/>
       </w:pPr>
       <w:r>
-        <w:rPr/>
+        <w:rPr>
+          <w:rFonts w:ascii="Arial" w:hAnsi="Arial"/>
+          <w:color w:val="000000"/>
+        </w:rPr>
         <w:t>Declarations: the study received no external funding; the author declares no competing interests; ethics approval is not applicable because the study uses publicly available de-identified cell-line and molecular data with no human participants, patient intervention, or animal experimentation. DepMap data are acknowledged and cited according to the provider’s guidance.</w:t>
       </w:r>
     </w:p>
@@ -90,7 +110,10 @@
         <w:rPr/>
       </w:pPr>
       <w:r>
-        <w:rPr/>
+        <w:rPr>
+          <w:rFonts w:ascii="Arial" w:hAnsi="Arial"/>
+          <w:color w:val="000000"/>
+        </w:rPr>
         <w:t>Validation: we report RMSE and MAE, drug-grouped held-out splits across five seeds, fold-local feature selection, leave-one-dataset-out validation, structured missingness strata, and modality redundancy summaries.</w:t>
       </w:r>
     </w:p>
@@ -101,7 +124,10 @@
         <w:rPr/>
       </w:pPr>
       <w:r>
-        <w:rPr/>
+        <w:rPr>
+          <w:rFonts w:ascii="Arial" w:hAnsi="Arial"/>
+          <w:color w:val="000000"/>
+        </w:rPr>
         <w:t>Main claim and significance: adding modalities should be judged by incremental value and transferability rather than dimensionality alone. The finding that fusion fails under cross-study transfer is relevant to information-fusion systems operating across heterogeneous sources.</w:t>
       </w:r>
     </w:p>
@@ -112,7 +138,10 @@
         <w:rPr/>
       </w:pPr>
       <w:r>
-        <w:rPr/>
+        <w:rPr>
+          <w:rFonts w:ascii="Arial" w:hAnsi="Arial"/>
+          <w:color w:val="000000"/>
+        </w:rPr>
         <w:t>All formal splits, feature-selection rules, derived result tables, figures, tests, and an identical reproducibility rerun are versioned in the repository. The manuscript limits claims to the declared 15-compound universe and identifies the lack of broad same-drug cross-study replication as a limitation.</w:t>
       </w:r>
     </w:p>
@@ -123,7 +152,10 @@
         <w:rPr/>
       </w:pPr>
       <w:r>
-        <w:rPr/>
+        <w:rPr>
+          <w:rFonts w:ascii="Arial" w:hAnsi="Arial"/>
+          <w:color w:val="000000"/>
+        </w:rPr>
         <w:t>This manuscript has not been published previously and is not under consideration elsewhere. We are submitting a non-anonymized manuscript and do not request reviewer blinding.</w:t>
       </w:r>
     </w:p>
@@ -135,7 +167,10 @@
         <w:rPr/>
       </w:pPr>
       <w:r>
-        <w:rPr/>
+        <w:rPr>
+          <w:rFonts w:ascii="Arial" w:hAnsi="Arial"/>
+          <w:color w:val="000000"/>
+        </w:rPr>
         <w:t>Sincerely,</w:t>
         <w:br/>
         <w:br/>

</xml_diff>

<commit_message>
Finalize submission correspondence wording
</commit_message>
<xml_diff>
--- a/submission/jpbi_cover_letter.docx
+++ b/submission/jpbi_cover_letter.docx
@@ -40,11 +40,7 @@
         <w:rPr/>
       </w:pPr>
       <w:r>
-        <w:rPr>
-          <w:rFonts w:ascii="Arial" w:hAnsi="Arial"/>
-          <w:color w:val="000000"/>
-        </w:rPr>
-        <w:t>We submit “When More Omics Is Not Always Better: Drug- and Dataset-Conditional Value of Multimodal Cancer Pharmacogenomics” as a Research article. The study evaluates multimodal information fusion for cancer drug-response prediction using a declared 15-compound universe spanning GDSC1, GDSC2, and CTD².</w:t>
+        <w:t>I submit “Multimodal Cancer Drug-Response Prediction Shows Small, Validation-Dependent Gains in a 15-Compound DepMap Benchmark” as a Research Article. The study evaluates multimodal information fusion for cancer drug-response prediction using a declared 15-compound universe spanning GDSC1, GDSC2, and CTD².</w:t>
       </w:r>
     </w:p>
     <w:p>
@@ -138,11 +134,7 @@
         <w:rPr/>
       </w:pPr>
       <w:r>
-        <w:rPr>
-          <w:rFonts w:ascii="Arial" w:hAnsi="Arial"/>
-          <w:color w:val="000000"/>
-        </w:rPr>
-        <w:t>All formal splits, feature-selection rules, derived result tables, figures, tests, and an identical reproducibility rerun are versioned in the repository. The manuscript limits claims to the declared 15-compound universe and identifies the lack of broad same-drug cross-study replication as a limitation.</w:t>
+        <w:t>All formal splits, feature-selection rules, derived result tables, figures, tests, and an identical reproducibility rerun are versioned in the repository. The manuscript limits claims to the declared 15-compound universe and identifies the lack of broad same-drug cross-study replication as a limitation. The immutable reproducibility archive is available at https://doi.org/10.5281/zenodo.23054361.</w:t>
       </w:r>
     </w:p>
     <w:p>
@@ -152,11 +144,7 @@
         <w:rPr/>
       </w:pPr>
       <w:r>
-        <w:rPr>
-          <w:rFonts w:ascii="Arial" w:hAnsi="Arial"/>
-          <w:color w:val="000000"/>
-        </w:rPr>
-        <w:t>This manuscript has not been published previously and is not under consideration elsewhere. We are submitting a non-anonymized manuscript and do not request reviewer blinding.</w:t>
+        <w:t>This manuscript has not been published previously and is not under consideration elsewhere. I am submitting a non-anonymized manuscript and do not request reviewer blinding.</w:t>
       </w:r>
     </w:p>
     <w:p>

</xml_diff>